<commit_message>
Content: link to GitHub again, and add it to the resume
The GitHub profile goes back where it was before the Oct 21 content refresh: a hero
icon, a contact row, the footer, a line under the work section, and the chat's contact
answer (which now links github.com URLs like LinkedIn's). The resume header gains it
too, re-exported as PDF and Word, still one page.

Co-Authored-By: Claude Opus 5.5 <noreply@anthropic.com>
</commit_message>
<xml_diff>
--- a/src/assets/Resume.docx
+++ b/src/assets/Resume.docx
@@ -47,7 +47,7 @@
         </w:rPr>
         <w:t xml:space="preserve">Salem, OR · jryther91@gmail.com · </w:t>
       </w:r>
-      <w:hyperlink w:history="1" r:id="rIdf-tavggpyaofb8oturwez">
+      <w:hyperlink w:history="1" r:id="rIdwfgfmckp9qngf45ktxvpx">
         <w:r>
           <w:rPr>
             <w:rFonts w:ascii="Calibri" w:cs="Calibri" w:eastAsia="Calibri" w:hAnsi="Calibri"/>
@@ -67,7 +67,27 @@
         </w:rPr>
         <w:t xml:space="preserve"> · </w:t>
       </w:r>
-      <w:hyperlink w:history="1" r:id="rIdmile61fo1mfr04pajxp4h">
+      <w:hyperlink w:history="1" r:id="rIdglrifaqdlwsnhrd-uzhfy">
+        <w:r>
+          <w:rPr>
+            <w:rFonts w:ascii="Calibri" w:cs="Calibri" w:eastAsia="Calibri" w:hAnsi="Calibri"/>
+            <w:color w:val="4F5D58"/>
+            <w:sz w:val="18"/>
+            <w:szCs w:val="18"/>
+          </w:rPr>
+          <w:t xml:space="preserve">github.com/jryther</w:t>
+        </w:r>
+      </w:hyperlink>
+      <w:r>
+        <w:rPr>
+          <w:rFonts w:ascii="Calibri" w:cs="Calibri" w:eastAsia="Calibri" w:hAnsi="Calibri"/>
+          <w:color w:val="4F5D58"/>
+          <w:sz w:val="18"/>
+          <w:szCs w:val="18"/>
+        </w:rPr>
+        <w:t xml:space="preserve"> · </w:t>
+      </w:r>
+      <w:hyperlink w:history="1" r:id="rIdyqsatyaikt5hlxjjdr4xc">
         <w:r>
           <w:rPr>
             <w:rFonts w:ascii="Calibri" w:cs="Calibri" w:eastAsia="Calibri" w:hAnsi="Calibri"/>
@@ -870,7 +890,7 @@
         </w:rPr>
         <w:t xml:space="preserve">AI-Powered Portfolio — </w:t>
       </w:r>
-      <w:hyperlink w:history="1" r:id="rIdol8or1zm3bzf2tmsso4ca">
+      <w:hyperlink w:history="1" r:id="rIdi7z3rrehwmkw_rpxppweo">
         <w:r>
           <w:rPr>
             <w:rFonts w:ascii="Calibri" w:cs="Calibri" w:eastAsia="Calibri" w:hAnsi="Calibri"/>

</xml_diff>